<commit_message>
Add transmission reliability & Hurricane Harvey backup-power analysis
Add a transmission-reliability discussion benchmarked to Hurricane Harvey
(2017 landfall at Corpus): six 345 kV and 200+ 69-138 kV line forced
outages, ~500 transmission structures and ~3,100+ distribution poles
damaged, Port Aransas substation surge-flooded, ~2-week restoration in the
hardest-hit coastal zone. Reframes the 'always reliable' assumption (true
for blue-sky/N-1) and sizes backup/islanding to a multi-day-to-2-week
restoration window with storm hardening. Expands HTML and Word to 3 pages.

Co-Authored-By: Claude Opus 4.8 <noreply@anthropic.com>
Claude-Session: https://claude.ai/code/session_011PupKYUXuDFxY4cSGZYyVh
</commit_message>
<xml_diff>
--- a/docs/corpus-shore-power-rfp/corpus-area-power-infrastructure.docx
+++ b/docs/corpus-shore-power-rfp/corpus-area-power-infrastructure.docx
@@ -1574,6 +1574,11 @@
       </w:r>
     </w:p>
     <w:p>
+      <w:r>
+        <w:br w:type="page"/>
+      </w:r>
+    </w:p>
+    <w:p>
       <w:pPr>
         <w:spacing w:before="200" w:after="60"/>
         <w:pBdr>
@@ -1587,7 +1592,7 @@
           <w:color w:val="0B5D8F"/>
           <w:sz w:val="22"/>
         </w:rPr>
-        <w:t>5. Resiliency &amp; Power Infrastructure</w:t>
+        <w:t>5. Transmission Reliability &amp; the Harvey Benchmark</w:t>
       </w:r>
     </w:p>
     <w:p>
@@ -1598,7 +1603,7 @@
           <w:color w:val="1A2230"/>
           <w:sz w:val="20"/>
         </w:rPr>
-        <w:t xml:space="preserve">Corpus Christi is a </w:t>
+        <w:t xml:space="preserve">Under normal “blue-sky” conditions the 345 kV and 138 kV network is effectively always available: bulk-transmission availability routinely exceeds </w:t>
       </w:r>
       <w:r>
         <w:rPr>
@@ -1607,7 +1612,7 @@
           <w:color w:val="1A2230"/>
           <w:sz w:val="20"/>
         </w:rPr>
-        <w:t>hurricane-exposed coastal industrial port</w:t>
+        <w:t>99.9%</w:t>
       </w:r>
       <w:r>
         <w:rPr>
@@ -1616,7 +1621,296 @@
           <w:color w:val="1A2230"/>
           <w:sz w:val="20"/>
         </w:rPr>
-        <w:t xml:space="preserve"> (cf. Hurricane Harvey, 2017). Shore power is mission-supporting infrastructure, so the design must assume severe-weather and contingency conditions:</w:t>
+        <w:t xml:space="preserve">, and </w:t>
+      </w:r>
+      <w:r>
+        <w:rPr>
+          <w:b/>
+          <w:i w:val="0"/>
+          <w:color w:val="1A2230"/>
+          <w:sz w:val="20"/>
+        </w:rPr>
+        <w:t>N-1</w:t>
+      </w:r>
+      <w:r>
+        <w:rPr>
+          <w:b w:val="0"/>
+          <w:i w:val="0"/>
+          <w:color w:val="1A2230"/>
+          <w:sz w:val="20"/>
+        </w:rPr>
+        <w:t xml:space="preserve"> design ensures any single line or transformer can fail without dropping load. The correct planning assumption is therefore not that the grid </w:t>
+      </w:r>
+      <w:r>
+        <w:rPr>
+          <w:b w:val="0"/>
+          <w:i/>
+          <w:color w:val="1A2230"/>
+          <w:sz w:val="20"/>
+        </w:rPr>
+        <w:t>never</w:t>
+      </w:r>
+      <w:r>
+        <w:rPr>
+          <w:b w:val="0"/>
+          <w:i w:val="0"/>
+          <w:color w:val="1A2230"/>
+          <w:sz w:val="20"/>
+        </w:rPr>
+        <w:t xml:space="preserve"> fails, but that it is highly reliable </w:t>
+      </w:r>
+      <w:r>
+        <w:rPr>
+          <w:b/>
+          <w:i w:val="0"/>
+          <w:color w:val="1A2230"/>
+          <w:sz w:val="20"/>
+        </w:rPr>
+        <w:t>except under a major hurricane</w:t>
+      </w:r>
+      <w:r>
+        <w:rPr>
+          <w:b w:val="0"/>
+          <w:i w:val="0"/>
+          <w:color w:val="1A2230"/>
+          <w:sz w:val="20"/>
+        </w:rPr>
+        <w:t xml:space="preserve"> — the one scenario a Gulf-coast port must explicitly design for. </w:t>
+      </w:r>
+      <w:r>
+        <w:rPr>
+          <w:b/>
+          <w:i w:val="0"/>
+          <w:color w:val="1A2230"/>
+          <w:sz w:val="20"/>
+        </w:rPr>
+        <w:t>Hurricane Harvey</w:t>
+      </w:r>
+      <w:r>
+        <w:rPr>
+          <w:b w:val="0"/>
+          <w:i w:val="0"/>
+          <w:color w:val="1A2230"/>
+          <w:sz w:val="20"/>
+        </w:rPr>
+        <w:t xml:space="preserve"> (Category 4, landfall at Rockport/Port Aransas essentially at Corpus Christi, Aug 2017) is the governing benchmark and shows that even the bulk transmission system is not immune:</w:t>
+      </w:r>
+    </w:p>
+    <w:p>
+      <w:pPr>
+        <w:spacing w:after="20"/>
+      </w:pPr>
+      <w:r>
+        <w:rPr>
+          <w:b/>
+          <w:i w:val="0"/>
+          <w:color w:val="0B5D8F"/>
+          <w:sz w:val="19"/>
+        </w:rPr>
+        <w:t>Harvey at a glance (AEP Texas / ERCOT South-Coastal):</w:t>
+      </w:r>
+    </w:p>
+    <w:p>
+      <w:pPr>
+        <w:pStyle w:val="ListBullet"/>
+        <w:spacing w:after="40" w:line="259" w:lineRule="auto"/>
+      </w:pPr>
+      <w:r>
+        <w:rPr>
+          <w:b w:val="0"/>
+          <w:i w:val="0"/>
+          <w:color w:val="1A2230"/>
+          <w:sz w:val="19"/>
+        </w:rPr>
+        <w:t xml:space="preserve">Forced outages on </w:t>
+      </w:r>
+      <w:r>
+        <w:rPr>
+          <w:b/>
+          <w:i w:val="0"/>
+          <w:color w:val="1A2230"/>
+          <w:sz w:val="19"/>
+        </w:rPr>
+        <w:t>six 345 kV lines</w:t>
+      </w:r>
+      <w:r>
+        <w:rPr>
+          <w:b w:val="0"/>
+          <w:i w:val="0"/>
+          <w:color w:val="1A2230"/>
+          <w:sz w:val="19"/>
+        </w:rPr>
+        <w:t xml:space="preserve"> and </w:t>
+      </w:r>
+      <w:r>
+        <w:rPr>
+          <w:b/>
+          <w:i w:val="0"/>
+          <w:color w:val="1A2230"/>
+          <w:sz w:val="19"/>
+        </w:rPr>
+        <w:t>200+ 69–138 kV lines</w:t>
+      </w:r>
+      <w:r>
+        <w:rPr>
+          <w:b w:val="0"/>
+          <w:i w:val="0"/>
+          <w:color w:val="1A2230"/>
+          <w:sz w:val="19"/>
+        </w:rPr>
+        <w:t xml:space="preserve"> along the coast.</w:t>
+      </w:r>
+    </w:p>
+    <w:p>
+      <w:pPr>
+        <w:pStyle w:val="ListBullet"/>
+        <w:spacing w:after="40" w:line="259" w:lineRule="auto"/>
+      </w:pPr>
+      <w:r>
+        <w:rPr>
+          <w:b/>
+          <w:i w:val="0"/>
+          <w:color w:val="1A2230"/>
+          <w:sz w:val="19"/>
+        </w:rPr>
+        <w:t>~25% of AEP Texas’s ~1M customers</w:t>
+      </w:r>
+      <w:r>
+        <w:rPr>
+          <w:b w:val="0"/>
+          <w:i w:val="0"/>
+          <w:color w:val="1A2230"/>
+          <w:sz w:val="19"/>
+        </w:rPr>
+        <w:t xml:space="preserve"> lost power; ~3,100+ distribution poles and ~500 transmission structures damaged; ~712 miles of conductor replaced; 5,600 mutual-aid linemen.</w:t>
+      </w:r>
+    </w:p>
+    <w:p>
+      <w:pPr>
+        <w:pStyle w:val="ListBullet"/>
+        <w:spacing w:after="40" w:line="259" w:lineRule="auto"/>
+      </w:pPr>
+      <w:r>
+        <w:rPr>
+          <w:b/>
+          <w:i w:val="0"/>
+          <w:color w:val="1A2230"/>
+          <w:sz w:val="19"/>
+        </w:rPr>
+        <w:t>A Port Aransas substation was swamped by storm surge</w:t>
+      </w:r>
+      <w:r>
+        <w:rPr>
+          <w:b w:val="0"/>
+          <w:i w:val="0"/>
+          <w:color w:val="1A2230"/>
+          <w:sz w:val="19"/>
+        </w:rPr>
+        <w:t xml:space="preserve"> — saltwater destroyed breakers, which had to be replaced.</w:t>
+      </w:r>
+    </w:p>
+    <w:p>
+      <w:pPr>
+        <w:pStyle w:val="ListBullet"/>
+        <w:spacing w:after="40" w:line="259" w:lineRule="auto"/>
+      </w:pPr>
+      <w:r>
+        <w:rPr>
+          <w:b/>
+          <w:i w:val="0"/>
+          <w:color w:val="1A2230"/>
+          <w:sz w:val="19"/>
+        </w:rPr>
+        <w:t>Corpus’s Inner Harbor recovered in days</w:t>
+      </w:r>
+      <w:r>
+        <w:rPr>
+          <w:b w:val="0"/>
+          <w:i w:val="0"/>
+          <w:color w:val="1A2230"/>
+          <w:sz w:val="19"/>
+        </w:rPr>
+        <w:t xml:space="preserve"> (~12,000 peak outages); the hardest-hit coastal communities nearest the entrance and La Quinta/Ingleside were </w:t>
+      </w:r>
+      <w:r>
+        <w:rPr>
+          <w:b/>
+          <w:i w:val="0"/>
+          <w:color w:val="1A2230"/>
+          <w:sz w:val="19"/>
+        </w:rPr>
+        <w:t>not fully restored for ~2 weeks</w:t>
+      </w:r>
+      <w:r>
+        <w:rPr>
+          <w:b w:val="0"/>
+          <w:i w:val="0"/>
+          <w:color w:val="1A2230"/>
+          <w:sz w:val="19"/>
+        </w:rPr>
+        <w:t>.</w:t>
+      </w:r>
+    </w:p>
+    <w:p>
+      <w:pPr>
+        <w:spacing w:before="80" w:after="120"/>
+        <w:shd w:val="clear" w:fill="F1F5F9"/>
+        <w:pBdr>
+          <w:left w:val="single" w:sz="18" w:space="8" w:color="0F8A6A"/>
+        </w:pBdr>
+      </w:pPr>
+      <w:r>
+        <w:rPr>
+          <w:b/>
+          <w:i w:val="0"/>
+          <w:color w:val="1A2230"/>
+          <w:sz w:val="19"/>
+        </w:rPr>
+        <w:t xml:space="preserve">Implication for backup power: </w:t>
+      </w:r>
+      <w:r>
+        <w:rPr>
+          <w:b w:val="0"/>
+          <w:i w:val="0"/>
+          <w:color w:val="1A2230"/>
+          <w:sz w:val="19"/>
+        </w:rPr>
+        <w:t xml:space="preserve">shore power cannot assume grid availability during a Harvey-class event. For priority berths, backup/islanding should be sized to a </w:t>
+      </w:r>
+      <w:r>
+        <w:rPr>
+          <w:b/>
+          <w:i w:val="0"/>
+          <w:color w:val="1A2230"/>
+          <w:sz w:val="19"/>
+        </w:rPr>
+        <w:t>multi-day to ~2-week restoration window</w:t>
+      </w:r>
+      <w:r>
+        <w:rPr>
+          <w:b w:val="0"/>
+          <w:i w:val="0"/>
+          <w:color w:val="1A2230"/>
+          <w:sz w:val="19"/>
+        </w:rPr>
+        <w:t xml:space="preserve"> — favoring on-site/standby generation paired with BESS rather than batteries alone — and coastal substations and switchgear must be hardened against storm surge and saltwater intrusion (elevated pads, sealed/submersible-rated breakers) per the Port Aransas failure mode. Because the entrance and La Quinta/Ingleside berths sit nearer the worst-hit zone than the Inner Harbor, backup duration should scale by berth location.</w:t>
+      </w:r>
+    </w:p>
+    <w:p>
+      <w:pPr>
+        <w:spacing w:before="200" w:after="60"/>
+        <w:pBdr>
+          <w:bottom w:val="single" w:sz="8" w:space="2" w:color="0B5D8F"/>
+        </w:pBdr>
+      </w:pPr>
+      <w:r>
+        <w:rPr>
+          <w:b/>
+          <w:caps/>
+          <w:color w:val="0B5D8F"/>
+          <w:sz w:val="22"/>
+        </w:rPr>
+        <w:t>6. Resiliency Measures &amp; Backup Power</w:t>
       </w:r>
     </w:p>
     <w:p>
@@ -1640,7 +1934,7 @@
           <w:color w:val="1A2230"/>
           <w:sz w:val="19"/>
         </w:rPr>
-        <w:t>the dedicated port substation should take dual 138 kV sources from independent points on the ring so a single line or transformer outage does not de-energize the berths.</w:t>
+        <w:t>the dedicated port substation takes dual 138 kV sources from independent points on the ring, so a single line/transformer outage cannot de-energize the berths.</w:t>
       </w:r>
     </w:p>
     <w:p>
@@ -1679,7 +1973,7 @@
           <w:color w:val="1A2230"/>
           <w:sz w:val="19"/>
         </w:rPr>
-        <w:t xml:space="preserve">Battery energy storage (BESS): </w:t>
+        <w:t xml:space="preserve">BESS: </w:t>
       </w:r>
       <w:r>
         <w:rPr>
@@ -1688,7 +1982,31 @@
           <w:color w:val="1A2230"/>
           <w:sz w:val="19"/>
         </w:rPr>
-        <w:t>peak-shaving to manage demand charges, ride-through for momentary disturbances, and smoother load steps as vessels connect/disconnect.</w:t>
+        <w:t>peak-shaving, ride-through for momentary disturbances, and smoother load steps as vessels connect/disconnect.</w:t>
+      </w:r>
+    </w:p>
+    <w:p>
+      <w:pPr>
+        <w:pStyle w:val="ListBullet"/>
+        <w:spacing w:after="40" w:line="259" w:lineRule="auto"/>
+      </w:pPr>
+      <w:r>
+        <w:rPr>
+          <w:b/>
+          <w:i w:val="0"/>
+          <w:color w:val="1A2230"/>
+          <w:sz w:val="19"/>
+        </w:rPr>
+        <w:t xml:space="preserve">On-site / standby generation: </w:t>
+      </w:r>
+      <w:r>
+        <w:rPr>
+          <w:b w:val="0"/>
+          <w:i w:val="0"/>
+          <w:color w:val="1A2230"/>
+          <w:sz w:val="19"/>
+        </w:rPr>
+        <w:t>for storm-duration islanding beyond battery economics, sized to priority-berth load over the expected restoration window.</w:t>
       </w:r>
     </w:p>
     <w:p>
@@ -1712,7 +2030,7 @@
           <w:color w:val="1A2230"/>
           <w:sz w:val="19"/>
         </w:rPr>
-        <w:t>ability to island critical berths on local generation/BESS during grid outages, with black-start capability for priority docks.</w:t>
+        <w:t>island critical berths on local generation/BESS during grid outages, with black-start capability for priority docks.</w:t>
       </w:r>
     </w:p>
     <w:p>
@@ -1727,7 +2045,7 @@
           <w:color w:val="1A2230"/>
           <w:sz w:val="19"/>
         </w:rPr>
-        <w:t xml:space="preserve">Power quality: </w:t>
+        <w:t xml:space="preserve">Storm hardening: </w:t>
       </w:r>
       <w:r>
         <w:rPr>
@@ -1736,7 +2054,7 @@
           <w:color w:val="1A2230"/>
           <w:sz w:val="19"/>
         </w:rPr>
-        <w:t>frequency conversion (50/60 Hz vessels), harmonic mitigation, reactive support, and N+1 shore-power converters so one failed unit does not strand a berth.</w:t>
+        <w:t>elevated/flood-rated pads, wind-rated structures, sealed/surge-rated switchgear, and corrosion protection for the marine/salt-air environment.</w:t>
       </w:r>
     </w:p>
     <w:p>
@@ -1751,7 +2069,7 @@
           <w:color w:val="1A2230"/>
           <w:sz w:val="19"/>
         </w:rPr>
-        <w:t xml:space="preserve">Hardening: </w:t>
+        <w:t xml:space="preserve">Power quality &amp; redundant conversion: </w:t>
       </w:r>
       <w:r>
         <w:rPr>
@@ -1760,7 +2078,7 @@
           <w:color w:val="1A2230"/>
           <w:sz w:val="19"/>
         </w:rPr>
-        <w:t>elevated/flood-rated equipment pads, wind-rated structures, and corrosion protection for the marine/salt-air environment.</w:t>
+        <w:t>frequency conversion (50/60 Hz vessels), harmonic mitigation, reactive support, and N+1 shore-power converters so one failed unit does not strand a berth.</w:t>
       </w:r>
     </w:p>
     <w:p>
@@ -1787,7 +2105,7 @@
           <w:color w:val="1A2230"/>
           <w:sz w:val="19"/>
         </w:rPr>
-        <w:t>berths remain serviceable through a single transmission contingency and can ride through / island during regional disturbances — protecting both air-quality compliance and continuity of port operations.</w:t>
+        <w:t>priority berths ride through a single transmission contingency without interruption and can island for a defined storm-restoration window — protecting air-quality compliance and continuity of port operations through the next Harvey-class event.</w:t>
       </w:r>
     </w:p>
     <w:p>
@@ -1810,7 +2128,7 @@
           <w:color w:val="1A2230"/>
           <w:sz w:val="19"/>
         </w:rPr>
-        <w:t>(1) surveyed per-berth load profiles and coincident-demand diversity; (2) a costed Phase 1 pilot vs. Phase 4 138 kV substation comparison; (3) a mapped ERCOT/AEP Texas interconnection pathway with LLIS timing; and (4) a recommended BESS/microgrid resiliency package with availability targets — concluding with a go/no-go recommendation and a phased implementation roadmap.</w:t>
+        <w:t>(1) surveyed per-berth load profiles and coincident-demand diversity; (2) a costed Phase 1 pilot vs. Phase 4 138 kV substation comparison; (3) a mapped ERCOT/AEP Texas interconnection pathway with LLIS timing; (4) a recommended BESS/microgrid resiliency package with availability targets; and (5) a storm-resilience basis of design benchmarked to Hurricane Harvey, sizing backup/islanding to the expected restoration window by berth location — concluding with a go/no-go recommendation and a phased implementation roadmap.</w:t>
       </w:r>
     </w:p>
     <w:p>
@@ -1825,7 +2143,7 @@
           <w:color w:val="5A6573"/>
           <w:sz w:val="15"/>
         </w:rPr>
-        <w:t>Sources: USACE/Port Corpus Christi CCSC Channel Improvement Project (2019); ERCOT NPRR1234 / PGRR115, Large Load Integration; AEP Texas / ETT filings; CPS Energy / Talen; IEC/IEEE 80005-1.</w:t>
+        <w:t>Sources: USACE/Port Corpus Christi CCSC Channel Improvement Project (2019); ERCOT NPRR1234 / PGRR115 &amp; Harvey response; AEP Texas / ETT filings; U.S. DOE/EIA Hurricane Harvey event reports; CPS Energy / Talen; IEC/IEEE 80005-1.</w:t>
       </w:r>
     </w:p>
     <w:sectPr>

</xml_diff>

<commit_message>
Add coastal storm-surge section, local-firm note; rename Figure 1
- Integrate coastal expert content: NWS SLOSH 'maximum of maximums' surge
  footprint and a recommendation to use the USACE Coastal Hazard System for
  AEP-based protective elevations of power infrastructure.
- Add Figure 2 slot for the NWS 100-yr AEP storm-surge inundation map
  (placeholder pending the image file).
- Note local firm with 30+ design professionals in Corpus Christi.
- Rename Figure 1 to 'Geographic Network Diagram' and drop the USACE
  reference from the figure caption.
- Restructure HTML and Word to 4 pages.

Co-Authored-By: Claude Opus 4.8 <noreply@anthropic.com>
Claude-Session: https://claude.ai/code/session_011PupKYUXuDFxY4cSGZYyVh
</commit_message>
<xml_diff>
--- a/docs/corpus-shore-power-rfp/corpus-area-power-infrastructure.docx
+++ b/docs/corpus-shore-power-rfp/corpus-area-power-infrastructure.docx
@@ -84,7 +84,25 @@
           <w:color w:val="1A2230"/>
           <w:sz w:val="19"/>
         </w:rPr>
-        <w:t xml:space="preserve">. The material below frames our understanding of the problem and the scope our study will rigorously evaluate — it is </w:t>
+        <w:t xml:space="preserve">. As a </w:t>
+      </w:r>
+      <w:r>
+        <w:rPr>
+          <w:b/>
+          <w:i w:val="0"/>
+          <w:color w:val="1A2230"/>
+          <w:sz w:val="19"/>
+        </w:rPr>
+        <w:t>local firm with more than 30 design professionals based in Corpus Christi</w:t>
+      </w:r>
+      <w:r>
+        <w:rPr>
+          <w:b w:val="0"/>
+          <w:i w:val="0"/>
+          <w:color w:val="1A2230"/>
+          <w:sz w:val="19"/>
+        </w:rPr>
+        <w:t xml:space="preserve"> — including in-house coastal, electrical, and infrastructure expertise — we bring on-the-ground knowledge of the port, the AEP Texas grid, and the region's coastal hazards. The material below frames our understanding of the problem and the scope our study will rigorously evaluate — it is </w:t>
       </w:r>
       <w:r>
         <w:rPr>
@@ -732,7 +750,7 @@
           <w:color w:val="5A6573"/>
           <w:sz w:val="16"/>
         </w:rPr>
-        <w:t>Figure 1 — Schematic (not to scale), oriented to the USACE Corpus Christi Ship Channel Improvement Project (Aug 2019). Reaches Gulf-to-inland: Entrance/Jetty (3.9 mi), Lower Bay (8.6 mi), Upper Bay (9.6 mi), Inner Harbor (7.3 mi), with the La Quinta Channel (5.9 mi) branching north. Power assets and berth locations are approximate; a surveyed GIS alignment is to be developed during the feasibility study.</w:t>
+        <w:t>Figure 1 — Geographic Network Diagram (not to scale). Channel reaches Gulf-to-inland: Entrance/Jetty (3.9 mi), Lower Bay (8.6 mi), Upper Bay (9.6 mi), Inner Harbor (7.3 mi), with the La Quinta Channel (5.9 mi) branching north. Power assets and berth locations are approximate; a surveyed GIS alignment is to be developed during the feasibility study.</w:t>
       </w:r>
     </w:p>
     <w:p>
@@ -1853,6 +1871,95 @@
     </w:p>
     <w:p>
       <w:pPr>
+        <w:spacing w:before="80" w:after="20"/>
+      </w:pPr>
+      <w:r>
+        <w:rPr>
+          <w:b/>
+          <w:i w:val="0"/>
+          <w:color w:val="1A2230"/>
+          <w:sz w:val="20"/>
+        </w:rPr>
+        <w:t>Coastal storm-surge exposure</w:t>
+      </w:r>
+    </w:p>
+    <w:p>
+      <w:r>
+        <w:rPr>
+          <w:b w:val="0"/>
+          <w:i w:val="0"/>
+          <w:color w:val="1A2230"/>
+          <w:sz w:val="20"/>
+        </w:rPr>
+        <w:t xml:space="preserve">Hurricane Harvey was a significant surge event, but by no means the worst that can be expected. SLOSH modeling by the National Weather Service (NWS) shows the “maximum of maximums” anticipated from storm surge; while it does not capture compound (rainfall/riverine) flooding, it clearly demonstrates the footprint where surge waters would propagate through the inner-harbor region. The NWS storm-surge inundation map for the 100-year annual exceedance probability (Figure 2) illustrates this footprint across the Corpus Christi inner harbor. We recommend using the U.S. Army Corps of Engineers (USACE) </w:t>
+      </w:r>
+      <w:r>
+        <w:rPr>
+          <w:b/>
+          <w:i w:val="0"/>
+          <w:color w:val="1A2230"/>
+          <w:sz w:val="20"/>
+        </w:rPr>
+        <w:t>Coastal Hazard System (CHS)</w:t>
+      </w:r>
+      <w:r>
+        <w:rPr>
+          <w:b w:val="0"/>
+          <w:i w:val="0"/>
+          <w:color w:val="1A2230"/>
+          <w:sz w:val="20"/>
+        </w:rPr>
+        <w:t xml:space="preserve"> to conduct a desktop analysis of </w:t>
+      </w:r>
+      <w:r>
+        <w:rPr>
+          <w:b/>
+          <w:i w:val="0"/>
+          <w:color w:val="1A2230"/>
+          <w:sz w:val="20"/>
+        </w:rPr>
+        <w:t>annual exceedance probabilities (AEPs)</w:t>
+      </w:r>
+      <w:r>
+        <w:rPr>
+          <w:b w:val="0"/>
+          <w:i w:val="0"/>
+          <w:color w:val="1A2230"/>
+          <w:sz w:val="20"/>
+        </w:rPr>
+        <w:t xml:space="preserve"> to determine the required protective elevations for power infrastructure — substations, switchgear, and shore-power converters.</w:t>
+      </w:r>
+    </w:p>
+    <w:p>
+      <w:pPr>
+        <w:spacing w:after="40"/>
+        <w:jc w:val="center"/>
+        <w:shd w:val="clear" w:fill="F1F5F9"/>
+      </w:pPr>
+      <w:r>
+        <w:rPr>
+          <w:i/>
+          <w:color w:val="5A6573"/>
+          <w:sz w:val="18"/>
+        </w:rPr>
+        <w:t>[ NWS storm-surge inundation map (100-yr annual exceedance probability), Corpus Christi inner harbor — image to be embedded ]</w:t>
+      </w:r>
+    </w:p>
+    <w:p>
+      <w:pPr>
+        <w:spacing w:after="80"/>
+      </w:pPr>
+      <w:r>
+        <w:rPr>
+          <w:i/>
+          <w:color w:val="5A6573"/>
+          <w:sz w:val="16"/>
+        </w:rPr>
+        <w:t>Figure 2 — NWS storm-surge inundation map, 100-year annual exceedance probability, Corpus Christi inner harbor. Surge-depth bands (4–6 ft up to 18–25 ft) define the inundation footprint that governs siting and protective elevation of port power infrastructure. Source: National Weather Service.</w:t>
+      </w:r>
+    </w:p>
+    <w:p>
+      <w:pPr>
         <w:spacing w:before="80" w:after="120"/>
         <w:shd w:val="clear" w:fill="F1F5F9"/>
         <w:pBdr>
@@ -1893,7 +2000,12 @@
           <w:color w:val="1A2230"/>
           <w:sz w:val="19"/>
         </w:rPr>
-        <w:t xml:space="preserve"> — favoring on-site/standby generation paired with BESS rather than batteries alone — and coastal substations and switchgear must be hardened against storm surge and saltwater intrusion (elevated pads, sealed/submersible-rated breakers) per the Port Aransas failure mode. Because the entrance and La Quinta/Ingleside berths sit nearer the worst-hit zone than the Inner Harbor, backup duration should scale by berth location.</w:t>
+        <w:t xml:space="preserve"> — favoring on-site/standby generation paired with BESS rather than batteries alone — and coastal substations and switchgear must be hardened against storm surge and saltwater intrusion (elevated pads, sealed/submersible-rated breakers) per the Port Aransas failure mode. Equipment platform elevations should be set from the USACE CHS / AEP analysis above. Because the entrance and La Quinta/Ingleside berths sit nearer the worst-hit zone than the Inner Harbor, backup duration and protective elevation should scale by berth location.</w:t>
+      </w:r>
+    </w:p>
+    <w:p>
+      <w:r>
+        <w:br w:type="page"/>
       </w:r>
     </w:p>
     <w:p>
@@ -2143,7 +2255,7 @@
           <w:color w:val="5A6573"/>
           <w:sz w:val="15"/>
         </w:rPr>
-        <w:t>Sources: USACE/Port Corpus Christi CCSC Channel Improvement Project (2019); ERCOT NPRR1234 / PGRR115 &amp; Harvey response; AEP Texas / ETT filings; U.S. DOE/EIA Hurricane Harvey event reports; CPS Energy / Talen; IEC/IEEE 80005-1.</w:t>
+        <w:t>Sources: USACE CCSC Channel Improvement Project (2019) &amp; Coastal Hazard System; NWS SLOSH storm-surge inundation mapping; ERCOT NPRR1234 / PGRR115 &amp; Harvey response; AEP Texas / ETT filings; U.S. DOE/EIA Hurricane Harvey event reports; CPS Energy / Talen; IEC/IEEE 80005-1.</w:t>
       </w:r>
     </w:p>
     <w:sectPr>

</xml_diff>

<commit_message>
Add Figure 2 storm-surge infographic (schematic from NWS map)
Recreate the NWS storm-surge inundation map as an inline SVG (color-matched
to the published 4-6 ft through 18-25 ft bands, with streets, bay, channel
plume, legend, scale, and compass) and embed it in Section 5 of both the
HTML and Word versions. Clearly labeled as a schematic representation
pending the source raster; rasterized PNG asset committed under assets/.

Co-Authored-By: Claude Opus 4.8 <noreply@anthropic.com>
Claude-Session: https://claude.ai/code/session_011PupKYUXuDFxY4cSGZYyVh
</commit_message>
<xml_diff>
--- a/docs/corpus-shore-power-rfp/corpus-area-power-infrastructure.docx
+++ b/docs/corpus-shore-power-rfp/corpus-area-power-infrastructure.docx
@@ -1934,15 +1934,40 @@
       <w:pPr>
         <w:spacing w:after="40"/>
         <w:jc w:val="center"/>
-        <w:shd w:val="clear" w:fill="F1F5F9"/>
       </w:pPr>
       <w:r>
-        <w:rPr>
-          <w:i/>
-          <w:color w:val="5A6573"/>
-          <w:sz w:val="18"/>
-        </w:rPr>
-        <w:t>[ NWS storm-surge inundation map (100-yr annual exceedance probability), Corpus Christi inner harbor — image to be embedded ]</w:t>
+        <w:drawing>
+          <wp:inline xmlns:a="http://schemas.openxmlformats.org/drawingml/2006/main" xmlns:pic="http://schemas.openxmlformats.org/drawingml/2006/picture">
+            <wp:extent cx="5852160" cy="2512986"/>
+            <wp:docPr id="2" name="Picture 2"/>
+            <wp:cNvGraphicFramePr>
+              <a:graphicFrameLocks noChangeAspect="1"/>
+            </wp:cNvGraphicFramePr>
+            <a:graphic>
+              <a:graphicData uri="http://schemas.openxmlformats.org/drawingml/2006/picture">
+                <pic:pic>
+                  <pic:nvPicPr>
+                    <pic:cNvPr id="0" name="storm-surge-corpus.png"/>
+                    <pic:cNvPicPr/>
+                  </pic:nvPicPr>
+                  <pic:blipFill>
+                    <a:blip r:embed="rId10"/>
+                    <a:stretch>
+                      <a:fillRect/>
+                    </a:stretch>
+                  </pic:blipFill>
+                  <pic:spPr>
+                    <a:xfrm>
+                      <a:off x="0" y="0"/>
+                      <a:ext cx="5852160" cy="2512986"/>
+                    </a:xfrm>
+                    <a:prstGeom prst="rect"/>
+                  </pic:spPr>
+                </pic:pic>
+              </a:graphicData>
+            </a:graphic>
+          </wp:inline>
+        </w:drawing>
       </w:r>
     </w:p>
     <w:p>
@@ -1955,7 +1980,7 @@
           <w:color w:val="5A6573"/>
           <w:sz w:val="16"/>
         </w:rPr>
-        <w:t>Figure 2 — NWS storm-surge inundation map, 100-year annual exceedance probability, Corpus Christi inner harbor. Surge-depth bands (4–6 ft up to 18–25 ft) define the inundation footprint that governs siting and protective elevation of port power infrastructure. Source: National Weather Service.</w:t>
+        <w:t>Figure 2 — Storm-surge inundation footprint, Corpus Christi inner harbor (NWS surge-depth bands, 4–6 ft up to 18–25 ft). Schematic representation of the published National Weather Service map, pending the source raster. The footprint — surge entering via the ship channel into the inner harbor and propagating up the low-lying corridors — governs siting and protective elevation of port power infrastructure. Source: National Weather Service (SLOSH).</w:t>
       </w:r>
     </w:p>
     <w:p>

</xml_diff>

<commit_message>
Revise backup power: vessels evacuate pre-landfall moots storm-duration backup
Per USCG Captain of the Port heavy-weather protocol, vessels above a defined
tonnage must depart berth (~24h before landfall) because moorings cannot
withstand tropical-cyclone forces. A Harvey-class outage therefore coincides
with an empty port and no hotelling load, mooting dedicated storm-duration
backup generation/islanding. Reframe the conclusion to survive-and-restore:
harden and elevate equipment to survive surge, re-energize rapidly; limit
on-site backup to controls/SCADA and brief ride-through. Updated in HTML and
Word.

Co-Authored-By: Claude Opus 4.8 <noreply@anthropic.com>
Claude-Session: https://claude.ai/code/session_011PupKYUXuDFxY4cSGZYyVh
</commit_message>
<xml_diff>
--- a/docs/corpus-shore-power-rfp/corpus-area-power-infrastructure.docx
+++ b/docs/corpus-shore-power-rfp/corpus-area-power-infrastructure.docx
@@ -1998,7 +1998,7 @@
           <w:color w:val="1A2230"/>
           <w:sz w:val="19"/>
         </w:rPr>
-        <w:t xml:space="preserve">Implication for backup power: </w:t>
+        <w:t xml:space="preserve">Implication for backup power — vessels depart before landfall. </w:t>
       </w:r>
       <w:r>
         <w:rPr>
@@ -2007,7 +2007,7 @@
           <w:color w:val="1A2230"/>
           <w:sz w:val="19"/>
         </w:rPr>
-        <w:t xml:space="preserve">shore power cannot assume grid availability during a Harvey-class event. For priority berths, backup/islanding should be sized to a </w:t>
+        <w:t xml:space="preserve">Under the U.S. Coast Guard Captain of the Port (COTP) heavy-weather protocol and the port's hurricane plan, vessels above a defined tonnage must </w:t>
       </w:r>
       <w:r>
         <w:rPr>
@@ -2016,7 +2016,7 @@
           <w:color w:val="1A2230"/>
           <w:sz w:val="19"/>
         </w:rPr>
-        <w:t>multi-day to ~2-week restoration window</w:t>
+        <w:t>leave berth (typically ≥24 hours before landfall)</w:t>
       </w:r>
       <w:r>
         <w:rPr>
@@ -2025,7 +2025,61 @@
           <w:color w:val="1A2230"/>
           <w:sz w:val="19"/>
         </w:rPr>
-        <w:t xml:space="preserve"> — favoring on-site/standby generation paired with BESS rather than batteries alone — and coastal substations and switchgear must be hardened against storm surge and saltwater intrusion (elevated pads, sealed/submersible-rated breakers) per the Port Aransas failure mode. Equipment platform elevations should be set from the USACE CHS / AEP analysis above. Because the entrance and La Quinta/Ingleside berths sit nearer the worst-hit zone than the Inner Harbor, backup duration and protective elevation should scale by berth location.</w:t>
+        <w:t xml:space="preserve"> because the moorings cannot withstand tropical-cyclone forces. A Harvey-class grid outage therefore coincides with a port that has </w:t>
+      </w:r>
+      <w:r>
+        <w:rPr>
+          <w:b/>
+          <w:i w:val="0"/>
+          <w:color w:val="1A2230"/>
+          <w:sz w:val="19"/>
+        </w:rPr>
+        <w:t>no large vessels at berth — effectively no hotelling load to serve</w:t>
+      </w:r>
+      <w:r>
+        <w:rPr>
+          <w:b w:val="0"/>
+          <w:i w:val="0"/>
+          <w:color w:val="1A2230"/>
+          <w:sz w:val="19"/>
+        </w:rPr>
+        <w:t xml:space="preserve"> during the storm and its multi-day restoration. This largely </w:t>
+      </w:r>
+      <w:r>
+        <w:rPr>
+          <w:b/>
+          <w:i w:val="0"/>
+          <w:color w:val="1A2230"/>
+          <w:sz w:val="19"/>
+        </w:rPr>
+        <w:t>moots the case for dedicated, storm-duration backup generation or islanding sized to vessel load.</w:t>
+      </w:r>
+      <w:r>
+        <w:rPr>
+          <w:b w:val="0"/>
+          <w:i w:val="0"/>
+          <w:color w:val="1A2230"/>
+          <w:sz w:val="19"/>
+        </w:rPr>
+        <w:t xml:space="preserve"> The resilience priority instead shifts to </w:t>
+      </w:r>
+      <w:r>
+        <w:rPr>
+          <w:b/>
+          <w:i w:val="0"/>
+          <w:color w:val="1A2230"/>
+          <w:sz w:val="19"/>
+        </w:rPr>
+        <w:t>survive-and-restore</w:t>
+      </w:r>
+      <w:r>
+        <w:rPr>
+          <w:b w:val="0"/>
+          <w:i w:val="0"/>
+          <w:color w:val="1A2230"/>
+          <w:sz w:val="19"/>
+        </w:rPr>
+        <w:t>: (1) harden and elevate the shore-power equipment so it survives surge and saltwater (platform elevations set from the USACE CHS / AEP analysis above), and (2) re-energize rapidly so berths are ready when vessels return. Any on-site backup is limited to controls/SCADA, life-safety, and brief ride-through — not multi-MW hotelling supply.</w:t>
       </w:r>
     </w:p>
     <w:p>
@@ -2134,7 +2188,7 @@
           <w:color w:val="1A2230"/>
           <w:sz w:val="19"/>
         </w:rPr>
-        <w:t xml:space="preserve">On-site / standby generation: </w:t>
+        <w:t xml:space="preserve">Right-sized backup (not storm-duration): </w:t>
       </w:r>
       <w:r>
         <w:rPr>
@@ -2143,7 +2197,7 @@
           <w:color w:val="1A2230"/>
           <w:sz w:val="19"/>
         </w:rPr>
-        <w:t>for storm-duration islanding beyond battery economics, sized to priority-berth load over the expected restoration window.</w:t>
+        <w:t>because vessels evacuate before landfall, backup is limited to controls/SCADA, security, and brief ride-through — no multi-MW standby generation for hotelling load during a storm outage.</w:t>
       </w:r>
     </w:p>
     <w:p>
@@ -2167,7 +2221,7 @@
           <w:color w:val="1A2230"/>
           <w:sz w:val="19"/>
         </w:rPr>
-        <w:t>island critical berths on local generation/BESS during grid outages, with black-start capability for priority docks.</w:t>
+        <w:t>optional islanding of a berth on local BESS during brief, non-storm transmission disturbances; not relied upon for hurricanes, when berths are vacated.</w:t>
       </w:r>
     </w:p>
     <w:p>
@@ -2182,7 +2236,7 @@
           <w:color w:val="1A2230"/>
           <w:sz w:val="19"/>
         </w:rPr>
-        <w:t xml:space="preserve">Storm hardening: </w:t>
+        <w:t xml:space="preserve">Storm hardening &amp; elevation (primary storm measure): </w:t>
       </w:r>
       <w:r>
         <w:rPr>
@@ -2191,7 +2245,7 @@
           <w:color w:val="1A2230"/>
           <w:sz w:val="19"/>
         </w:rPr>
-        <w:t>elevated/flood-rated pads, wind-rated structures, sealed/surge-rated switchgear, and corrosion protection for the marine/salt-air environment.</w:t>
+        <w:t>elevated/flood-rated pads set from the CHS/AEP analysis, wind-rated structures, sealed/surge-rated switchgear, and corrosion protection so the asset survives and restores quickly.</w:t>
       </w:r>
     </w:p>
     <w:p>
@@ -2242,7 +2296,7 @@
           <w:color w:val="1A2230"/>
           <w:sz w:val="19"/>
         </w:rPr>
-        <w:t>priority berths ride through a single transmission contingency without interruption and can island for a defined storm-restoration window — protecting air-quality compliance and continuity of port operations through the next Harvey-class event.</w:t>
+        <w:t>during normal operations, priority berths ride through a single transmission contingency without interruption; for hurricanes, the objective is survive-and-restore — equipment hardened and elevated to survive surge while vessels are evacuated, then rapidly re-energized — rather than sustained backup of an absent hotelling load.</w:t>
       </w:r>
     </w:p>
     <w:p>
@@ -2265,7 +2319,7 @@
           <w:color w:val="1A2230"/>
           <w:sz w:val="19"/>
         </w:rPr>
-        <w:t>(1) surveyed per-berth load profiles and coincident-demand diversity; (2) a costed Phase 1 pilot vs. Phase 4 138 kV substation comparison; (3) a mapped ERCOT/AEP Texas interconnection pathway with LLIS timing; (4) a recommended BESS/microgrid resiliency package with availability targets; and (5) a storm-resilience basis of design benchmarked to Hurricane Harvey, sizing backup/islanding to the expected restoration window by berth location — concluding with a go/no-go recommendation and a phased implementation roadmap.</w:t>
+        <w:t>(1) surveyed per-berth load profiles and coincident-demand diversity; (2) a costed Phase 1 pilot vs. Phase 4 138 kV substation comparison; (3) a mapped ERCOT/AEP Texas interconnection pathway with LLIS timing; (4) a recommended BESS/microgrid resiliency package with availability targets; and (5) a storm-resilience basis of design reflecting the COTP vessel-departure protocol — confirming that hardening, protective elevation, and rapid restoration (not storm-duration backup generation) are the right investments — benchmarked to Hurricane Harvey, and concluding with a go/no-go recommendation and a phased implementation roadmap.</w:t>
       </w:r>
     </w:p>
     <w:p>

</xml_diff>